<commit_message>
feat(onboarding): register cleaned parent consent template
</commit_message>
<xml_diff>
--- a/apps/api/templates/2_Parents_Consent_Fork.docx
+++ b/apps/api/templates/2_Parents_Consent_Fork.docx
@@ -34,7 +34,7 @@
       </w:pPr>
       <w:sdt>
         <w:sdtPr>
-          <w:id w:val="1823998798"/>
+          <w:id w:val="1099102175"/>
           <w:tag w:val="goog_rdk_0"/>
         </w:sdtPr>
         <w:sdtContent>
@@ -111,7 +111,7 @@
       </w:pPr>
       <w:sdt>
         <w:sdtPr>
-          <w:id w:val="-2099572241"/>
+          <w:id w:val="-520287522"/>
           <w:tag w:val="goog_rdk_1"/>
         </w:sdtPr>
         <w:sdtContent>
@@ -149,7 +149,13 @@
           <w:szCs w:val="18"/>
           <w:rtl w:val="0"/>
         </w:rPr>
-        <w:t xml:space="preserve">IMPORTANT — This form must be completed and signed by a parent or legal guardian for every Volunteer / Fork Lead / Contributor under 18 years of age. Submit together with the Volunteer &amp; Engagement Form (Form No. 1).&lt;line-break/&gt;&lt;line-break/&gt;Minimum age: 13 years. Those below 13 may not be onboarded.&lt;line-break/&gt;&lt;line-break/&gt;If the minor is 16 or older, they must also co-sign in Section F.</w:t>
+        <w:t xml:space="preserve">IMPORTANT — This form must be completed and signed by a parent or legal guardian for every Volunteer / Fork Lead / Contributor under 18 years of age. Submit together with the Volunteer &amp; Engagement Form (Form No. 1).</w:t>
+        <w:br w:type="textWrapping"/>
+        <w:br w:type="textWrapping"/>
+        <w:t xml:space="preserve">Minimum age: 13 years. Those below 13 may not be onboarded.</w:t>
+        <w:br w:type="textWrapping"/>
+        <w:br w:type="textWrapping"/>
+        <w:t xml:space="preserve">If the minor is 16 or older, they must also co-sign in Section F.</w:t>
       </w:r>
       <w:r>
         <w:rPr>
@@ -164,7 +170,7 @@
       </w:pPr>
       <w:sdt>
         <w:sdtPr>
-          <w:id w:val="1733754866"/>
+          <w:id w:val="-532885751"/>
           <w:tag w:val="goog_rdk_2"/>
         </w:sdtPr>
         <w:sdtContent>
@@ -230,7 +236,19 @@
           <w:szCs w:val="19"/>
           <w:rtl w:val="0"/>
         </w:rPr>
-        <w:t xml:space="preserve">Full Name of Minor - Aanya Jawahirani</w:t>
+        <w:t xml:space="preserve">Full Name of Minor -</w:t>
+      </w:r>
+      <w:r>
+        <w:rPr>
+          <w:rFonts w:ascii="Helvetica Neue" w:cs="Helvetica Neue" w:eastAsia="Helvetica Neue" w:hAnsi="Helvetica Neue"/>
+          <w:b w:val="1"/>
+          <w:bCs w:val="1"/>
+          <w:color w:val="413f3b"/>
+          <w:sz w:val="19"/>
+          <w:szCs w:val="19"/>
+          <w:rtl w:val="0"/>
+        </w:rPr>
+        <w:t xml:space="preserve"> </w:t>
       </w:r>
       <w:r>
         <w:rPr>
@@ -267,7 +285,19 @@
           <w:szCs w:val="19"/>
           <w:rtl w:val="0"/>
         </w:rPr>
-        <w:t xml:space="preserve">Date of Birth- 06/08/2011</w:t>
+        <w:t xml:space="preserve">Date of Birth-</w:t>
+      </w:r>
+      <w:r>
+        <w:rPr>
+          <w:rFonts w:ascii="Helvetica Neue" w:cs="Helvetica Neue" w:eastAsia="Helvetica Neue" w:hAnsi="Helvetica Neue"/>
+          <w:b w:val="1"/>
+          <w:bCs w:val="1"/>
+          <w:color w:val="413f3b"/>
+          <w:sz w:val="19"/>
+          <w:szCs w:val="19"/>
+          <w:rtl w:val="0"/>
+        </w:rPr>
+        <w:t xml:space="preserve"> </w:t>
       </w:r>
       <w:r>
         <w:rPr>
@@ -304,7 +334,19 @@
           <w:szCs w:val="19"/>
           <w:rtl w:val="0"/>
         </w:rPr>
-        <w:t xml:space="preserve">Age- 15 years</w:t>
+        <w:t xml:space="preserve">Age-</w:t>
+      </w:r>
+      <w:r>
+        <w:rPr>
+          <w:rFonts w:ascii="Helvetica Neue" w:cs="Helvetica Neue" w:eastAsia="Helvetica Neue" w:hAnsi="Helvetica Neue"/>
+          <w:b w:val="1"/>
+          <w:bCs w:val="1"/>
+          <w:color w:val="413f3b"/>
+          <w:sz w:val="19"/>
+          <w:szCs w:val="19"/>
+          <w:rtl w:val="0"/>
+        </w:rPr>
+        <w:t xml:space="preserve"> </w:t>
       </w:r>
       <w:r>
         <w:rPr>
@@ -341,7 +383,19 @@
           <w:szCs w:val="19"/>
           <w:rtl w:val="0"/>
         </w:rPr>
-        <w:t xml:space="preserve">Gender- Female</w:t>
+        <w:t xml:space="preserve">Gender-</w:t>
+      </w:r>
+      <w:r>
+        <w:rPr>
+          <w:rFonts w:ascii="Helvetica Neue" w:cs="Helvetica Neue" w:eastAsia="Helvetica Neue" w:hAnsi="Helvetica Neue"/>
+          <w:b w:val="1"/>
+          <w:bCs w:val="1"/>
+          <w:color w:val="413f3b"/>
+          <w:sz w:val="19"/>
+          <w:szCs w:val="19"/>
+          <w:rtl w:val="0"/>
+        </w:rPr>
+        <w:t xml:space="preserve"> </w:t>
       </w:r>
       <w:r>
         <w:rPr>
@@ -378,7 +432,19 @@
           <w:szCs w:val="19"/>
           <w:rtl w:val="0"/>
         </w:rPr>
-        <w:t xml:space="preserve">Class / Grade / Year- 10th</w:t>
+        <w:t xml:space="preserve">Class / Grade / Year-</w:t>
+      </w:r>
+      <w:r>
+        <w:rPr>
+          <w:rFonts w:ascii="Helvetica Neue" w:cs="Helvetica Neue" w:eastAsia="Helvetica Neue" w:hAnsi="Helvetica Neue"/>
+          <w:b w:val="1"/>
+          <w:bCs w:val="1"/>
+          <w:color w:val="413f3b"/>
+          <w:sz w:val="19"/>
+          <w:szCs w:val="19"/>
+          <w:rtl w:val="0"/>
+        </w:rPr>
+        <w:t xml:space="preserve"> </w:t>
       </w:r>
       <w:r>
         <w:rPr>
@@ -415,7 +481,19 @@
           <w:szCs w:val="19"/>
           <w:rtl w:val="0"/>
         </w:rPr>
-        <w:t xml:space="preserve">Institution Name- Centre Point School Kotal Road</w:t>
+        <w:t xml:space="preserve">Institution Name-</w:t>
+      </w:r>
+      <w:r>
+        <w:rPr>
+          <w:rFonts w:ascii="Helvetica Neue" w:cs="Helvetica Neue" w:eastAsia="Helvetica Neue" w:hAnsi="Helvetica Neue"/>
+          <w:b w:val="1"/>
+          <w:bCs w:val="1"/>
+          <w:color w:val="413f3b"/>
+          <w:sz w:val="19"/>
+          <w:szCs w:val="19"/>
+          <w:rtl w:val="0"/>
+        </w:rPr>
+        <w:t xml:space="preserve"> </w:t>
       </w:r>
       <w:r>
         <w:rPr>
@@ -452,7 +530,19 @@
           <w:szCs w:val="19"/>
           <w:rtl w:val="0"/>
         </w:rPr>
-        <w:t xml:space="preserve">City / District- Nagpur</w:t>
+        <w:t xml:space="preserve">City / District-</w:t>
+      </w:r>
+      <w:r>
+        <w:rPr>
+          <w:rFonts w:ascii="Helvetica Neue" w:cs="Helvetica Neue" w:eastAsia="Helvetica Neue" w:hAnsi="Helvetica Neue"/>
+          <w:b w:val="1"/>
+          <w:bCs w:val="1"/>
+          <w:color w:val="413f3b"/>
+          <w:sz w:val="19"/>
+          <w:szCs w:val="19"/>
+          <w:rtl w:val="0"/>
+        </w:rPr>
+        <w:t xml:space="preserve"> </w:t>
       </w:r>
       <w:r>
         <w:rPr>
@@ -489,7 +579,19 @@
           <w:szCs w:val="19"/>
           <w:rtl w:val="0"/>
         </w:rPr>
-        <w:t xml:space="preserve">State- Maharshtra</w:t>
+        <w:t xml:space="preserve">State-</w:t>
+      </w:r>
+      <w:r>
+        <w:rPr>
+          <w:rFonts w:ascii="Helvetica Neue" w:cs="Helvetica Neue" w:eastAsia="Helvetica Neue" w:hAnsi="Helvetica Neue"/>
+          <w:b w:val="1"/>
+          <w:bCs w:val="1"/>
+          <w:color w:val="413f3b"/>
+          <w:sz w:val="19"/>
+          <w:szCs w:val="19"/>
+          <w:rtl w:val="0"/>
+        </w:rPr>
+        <w:t xml:space="preserve"> </w:t>
       </w:r>
       <w:r>
         <w:rPr>
@@ -526,7 +628,19 @@
           <w:szCs w:val="19"/>
           <w:rtl w:val="0"/>
         </w:rPr>
-        <w:t xml:space="preserve">Discord Username----</w:t>
+        <w:t xml:space="preserve">Discord Username-</w:t>
+      </w:r>
+      <w:r>
+        <w:rPr>
+          <w:rFonts w:ascii="Helvetica Neue" w:cs="Helvetica Neue" w:eastAsia="Helvetica Neue" w:hAnsi="Helvetica Neue"/>
+          <w:b w:val="1"/>
+          <w:bCs w:val="1"/>
+          <w:color w:val="413f3b"/>
+          <w:sz w:val="19"/>
+          <w:szCs w:val="19"/>
+          <w:rtl w:val="0"/>
+        </w:rPr>
+        <w:t xml:space="preserve"> </w:t>
       </w:r>
       <w:r>
         <w:rPr>
@@ -551,7 +665,7 @@
       </w:pPr>
       <w:sdt>
         <w:sdtPr>
-          <w:id w:val="-1684439915"/>
+          <w:id w:val="342741150"/>
           <w:tag w:val="goog_rdk_3"/>
         </w:sdtPr>
         <w:sdtContent>
@@ -617,7 +731,19 @@
           <w:szCs w:val="19"/>
           <w:rtl w:val="0"/>
         </w:rPr>
-        <w:t xml:space="preserve">Full Name of Parent / Guardian- Roma Jawahirani</w:t>
+        <w:t xml:space="preserve">Full Name of Parent / Guardian-</w:t>
+      </w:r>
+      <w:r>
+        <w:rPr>
+          <w:rFonts w:ascii="Helvetica Neue" w:cs="Helvetica Neue" w:eastAsia="Helvetica Neue" w:hAnsi="Helvetica Neue"/>
+          <w:b w:val="1"/>
+          <w:bCs w:val="1"/>
+          <w:color w:val="413f3b"/>
+          <w:sz w:val="19"/>
+          <w:szCs w:val="19"/>
+          <w:rtl w:val="0"/>
+        </w:rPr>
+        <w:t xml:space="preserve"> </w:t>
       </w:r>
       <w:r>
         <w:rPr>
@@ -654,7 +780,19 @@
           <w:szCs w:val="19"/>
           <w:rtl w:val="0"/>
         </w:rPr>
-        <w:t xml:space="preserve">Relationship with Minor- Mother</w:t>
+        <w:t xml:space="preserve">Relationship with Minor-</w:t>
+      </w:r>
+      <w:r>
+        <w:rPr>
+          <w:rFonts w:ascii="Helvetica Neue" w:cs="Helvetica Neue" w:eastAsia="Helvetica Neue" w:hAnsi="Helvetica Neue"/>
+          <w:b w:val="1"/>
+          <w:bCs w:val="1"/>
+          <w:color w:val="413f3b"/>
+          <w:sz w:val="19"/>
+          <w:szCs w:val="19"/>
+          <w:rtl w:val="0"/>
+        </w:rPr>
+        <w:t xml:space="preserve"> </w:t>
       </w:r>
       <w:r>
         <w:rPr>
@@ -691,7 +829,19 @@
           <w:szCs w:val="19"/>
           <w:rtl w:val="0"/>
         </w:rPr>
-        <w:t xml:space="preserve">Phone Number (Primary)-8329338769</w:t>
+        <w:t xml:space="preserve">Phone Number (Primary)-</w:t>
+      </w:r>
+      <w:r>
+        <w:rPr>
+          <w:rFonts w:ascii="Helvetica Neue" w:cs="Helvetica Neue" w:eastAsia="Helvetica Neue" w:hAnsi="Helvetica Neue"/>
+          <w:b w:val="1"/>
+          <w:bCs w:val="1"/>
+          <w:color w:val="413f3b"/>
+          <w:sz w:val="19"/>
+          <w:szCs w:val="19"/>
+          <w:rtl w:val="0"/>
+        </w:rPr>
+        <w:t xml:space="preserve"> </w:t>
       </w:r>
       <w:r>
         <w:rPr>
@@ -728,7 +878,19 @@
           <w:szCs w:val="19"/>
           <w:rtl w:val="0"/>
         </w:rPr>
-        <w:t xml:space="preserve">Phone Number (Secondary)-8657538669</w:t>
+        <w:t xml:space="preserve">Phone Number (Secondary)-</w:t>
+      </w:r>
+      <w:r>
+        <w:rPr>
+          <w:rFonts w:ascii="Helvetica Neue" w:cs="Helvetica Neue" w:eastAsia="Helvetica Neue" w:hAnsi="Helvetica Neue"/>
+          <w:b w:val="1"/>
+          <w:bCs w:val="1"/>
+          <w:color w:val="413f3b"/>
+          <w:sz w:val="19"/>
+          <w:szCs w:val="19"/>
+          <w:rtl w:val="0"/>
+        </w:rPr>
+        <w:t xml:space="preserve"> </w:t>
       </w:r>
       <w:r>
         <w:rPr>
@@ -765,7 +927,19 @@
           <w:szCs w:val="19"/>
           <w:rtl w:val="0"/>
         </w:rPr>
-        <w:t xml:space="preserve">Email Address- jawahirani20@gmail.com</w:t>
+        <w:t xml:space="preserve">Email Address-</w:t>
+      </w:r>
+      <w:r>
+        <w:rPr>
+          <w:rFonts w:ascii="Helvetica Neue" w:cs="Helvetica Neue" w:eastAsia="Helvetica Neue" w:hAnsi="Helvetica Neue"/>
+          <w:b w:val="1"/>
+          <w:bCs w:val="1"/>
+          <w:color w:val="413f3b"/>
+          <w:sz w:val="19"/>
+          <w:szCs w:val="19"/>
+          <w:rtl w:val="0"/>
+        </w:rPr>
+        <w:t xml:space="preserve"> </w:t>
       </w:r>
       <w:r>
         <w:rPr>
@@ -802,7 +976,19 @@
           <w:szCs w:val="19"/>
           <w:rtl w:val="0"/>
         </w:rPr>
-        <w:t xml:space="preserve">WhatsApp Number- 8329338769</w:t>
+        <w:t xml:space="preserve">WhatsApp Number-</w:t>
+      </w:r>
+      <w:r>
+        <w:rPr>
+          <w:rFonts w:ascii="Helvetica Neue" w:cs="Helvetica Neue" w:eastAsia="Helvetica Neue" w:hAnsi="Helvetica Neue"/>
+          <w:b w:val="1"/>
+          <w:bCs w:val="1"/>
+          <w:color w:val="413f3b"/>
+          <w:sz w:val="19"/>
+          <w:szCs w:val="19"/>
+          <w:rtl w:val="0"/>
+        </w:rPr>
+        <w:t xml:space="preserve"> </w:t>
       </w:r>
       <w:r>
         <w:rPr>
@@ -839,7 +1025,19 @@
           <w:szCs w:val="19"/>
           <w:rtl w:val="0"/>
         </w:rPr>
-        <w:t xml:space="preserve">Residential Address- Plot No.4 CMPDI Road, PB’s Fitness studio</w:t>
+        <w:t xml:space="preserve">Residential Address-</w:t>
+      </w:r>
+      <w:r>
+        <w:rPr>
+          <w:rFonts w:ascii="Helvetica Neue" w:cs="Helvetica Neue" w:eastAsia="Helvetica Neue" w:hAnsi="Helvetica Neue"/>
+          <w:b w:val="1"/>
+          <w:bCs w:val="1"/>
+          <w:color w:val="413f3b"/>
+          <w:sz w:val="19"/>
+          <w:szCs w:val="19"/>
+          <w:rtl w:val="0"/>
+        </w:rPr>
+        <w:t xml:space="preserve"> </w:t>
       </w:r>
       <w:r>
         <w:rPr>
@@ -901,7 +1099,7 @@
       </w:pPr>
       <w:sdt>
         <w:sdtPr>
-          <w:id w:val="-20185120"/>
+          <w:id w:val="1487557954"/>
           <w:tag w:val="goog_rdk_4"/>
         </w:sdtPr>
         <w:sdtContent>
@@ -1116,7 +1314,7 @@
       </w:pPr>
       <w:sdt>
         <w:sdtPr>
-          <w:id w:val="-1237296767"/>
+          <w:id w:val="150974254"/>
           <w:tag w:val="goog_rdk_5"/>
         </w:sdtPr>
         <w:sdtContent>
@@ -1207,7 +1405,19 @@
           <w:szCs w:val="19"/>
           <w:rtl w:val="0"/>
         </w:rPr>
-        <w:t xml:space="preserve">Emergency Contact Full Name- Avinash Jawahirani</w:t>
+        <w:t xml:space="preserve">Emergency Contact Full Name-</w:t>
+      </w:r>
+      <w:r>
+        <w:rPr>
+          <w:rFonts w:ascii="Helvetica Neue" w:cs="Helvetica Neue" w:eastAsia="Helvetica Neue" w:hAnsi="Helvetica Neue"/>
+          <w:b w:val="1"/>
+          <w:bCs w:val="1"/>
+          <w:color w:val="413f3b"/>
+          <w:sz w:val="19"/>
+          <w:szCs w:val="19"/>
+          <w:rtl w:val="0"/>
+        </w:rPr>
+        <w:t xml:space="preserve"> </w:t>
       </w:r>
       <w:r>
         <w:rPr>
@@ -1244,7 +1454,19 @@
           <w:szCs w:val="19"/>
           <w:rtl w:val="0"/>
         </w:rPr>
-        <w:t xml:space="preserve">Relationship to Minor- Father</w:t>
+        <w:t xml:space="preserve">Relationship to Minor-</w:t>
+      </w:r>
+      <w:r>
+        <w:rPr>
+          <w:rFonts w:ascii="Helvetica Neue" w:cs="Helvetica Neue" w:eastAsia="Helvetica Neue" w:hAnsi="Helvetica Neue"/>
+          <w:b w:val="1"/>
+          <w:bCs w:val="1"/>
+          <w:color w:val="413f3b"/>
+          <w:sz w:val="19"/>
+          <w:szCs w:val="19"/>
+          <w:rtl w:val="0"/>
+        </w:rPr>
+        <w:t xml:space="preserve"> </w:t>
       </w:r>
       <w:r>
         <w:rPr>
@@ -1281,7 +1503,19 @@
           <w:szCs w:val="19"/>
           <w:rtl w:val="0"/>
         </w:rPr>
-        <w:t xml:space="preserve">Phone (Primary)- 8329338769</w:t>
+        <w:t xml:space="preserve">Phone (Primary)-</w:t>
+      </w:r>
+      <w:r>
+        <w:rPr>
+          <w:rFonts w:ascii="Helvetica Neue" w:cs="Helvetica Neue" w:eastAsia="Helvetica Neue" w:hAnsi="Helvetica Neue"/>
+          <w:b w:val="1"/>
+          <w:bCs w:val="1"/>
+          <w:color w:val="413f3b"/>
+          <w:sz w:val="19"/>
+          <w:szCs w:val="19"/>
+          <w:rtl w:val="0"/>
+        </w:rPr>
+        <w:t xml:space="preserve"> </w:t>
       </w:r>
       <w:r>
         <w:rPr>
@@ -1318,7 +1552,19 @@
           <w:szCs w:val="19"/>
           <w:rtl w:val="0"/>
         </w:rPr>
-        <w:t xml:space="preserve">Phone (Secondary / WhatsApp)-9970666998</w:t>
+        <w:t xml:space="preserve">Phone (Secondary / WhatsApp)-</w:t>
+      </w:r>
+      <w:r>
+        <w:rPr>
+          <w:rFonts w:ascii="Helvetica Neue" w:cs="Helvetica Neue" w:eastAsia="Helvetica Neue" w:hAnsi="Helvetica Neue"/>
+          <w:b w:val="1"/>
+          <w:bCs w:val="1"/>
+          <w:color w:val="413f3b"/>
+          <w:sz w:val="19"/>
+          <w:szCs w:val="19"/>
+          <w:rtl w:val="0"/>
+        </w:rPr>
+        <w:t xml:space="preserve"> </w:t>
       </w:r>
       <w:r>
         <w:rPr>
@@ -1355,7 +1601,19 @@
           <w:szCs w:val="19"/>
           <w:rtl w:val="0"/>
         </w:rPr>
-        <w:t xml:space="preserve">Email- avinashjawahirani315@gmail.com</w:t>
+        <w:t xml:space="preserve">Email-</w:t>
+      </w:r>
+      <w:r>
+        <w:rPr>
+          <w:rFonts w:ascii="Helvetica Neue" w:cs="Helvetica Neue" w:eastAsia="Helvetica Neue" w:hAnsi="Helvetica Neue"/>
+          <w:b w:val="1"/>
+          <w:bCs w:val="1"/>
+          <w:color w:val="413f3b"/>
+          <w:sz w:val="19"/>
+          <w:szCs w:val="19"/>
+          <w:rtl w:val="0"/>
+        </w:rPr>
+        <w:t xml:space="preserve"> </w:t>
       </w:r>
       <w:r>
         <w:rPr>
@@ -1380,7 +1638,7 @@
       </w:pPr>
       <w:sdt>
         <w:sdtPr>
-          <w:id w:val="-328865371"/>
+          <w:id w:val="-294129587"/>
           <w:tag w:val="goog_rdk_6"/>
         </w:sdtPr>
         <w:sdtContent>
@@ -1461,7 +1719,7 @@
       </w:pPr>
       <w:sdt>
         <w:sdtPr>
-          <w:id w:val="-1244640856"/>
+          <w:id w:val="420220037"/>
           <w:tag w:val="goog_rdk_7"/>
         </w:sdtPr>
         <w:sdtContent>
@@ -1470,7 +1728,7 @@
               <w:rFonts w:ascii="Cardo" w:cs="Cardo" w:eastAsia="Cardo" w:hAnsi="Cardo"/>
               <w:rtl w:val="0"/>
             </w:rPr>
-            <w:t xml:space="preserve">☑</w:t>
+            <w:t xml:space="preserve">☐</w:t>
           </w:r>
         </w:sdtContent>
       </w:sdt>
@@ -1499,7 +1757,7 @@
       </w:pPr>
       <w:sdt>
         <w:sdtPr>
-          <w:id w:val="-500127699"/>
+          <w:id w:val="973368435"/>
           <w:tag w:val="goog_rdk_8"/>
         </w:sdtPr>
         <w:sdtContent>
@@ -1508,13 +1766,13 @@
               <w:rFonts w:ascii="Cardo" w:cs="Cardo" w:eastAsia="Cardo" w:hAnsi="Cardo"/>
               <w:rtl w:val="0"/>
             </w:rPr>
-            <w:t xml:space="preserve">☑</w:t>
+            <w:t xml:space="preserve">☐</w:t>
           </w:r>
         </w:sdtContent>
       </w:sdt>
       <w:sdt>
         <w:sdtPr>
-          <w:id w:val="-1776360394"/>
+          <w:id w:val="1191992366"/>
           <w:tag w:val="goog_rdk_9"/>
         </w:sdtPr>
         <w:sdtContent>
@@ -1545,7 +1803,7 @@
       </w:pPr>
       <w:sdt>
         <w:sdtPr>
-          <w:id w:val="-1508951581"/>
+          <w:id w:val="1628065308"/>
           <w:tag w:val="goog_rdk_10"/>
         </w:sdtPr>
         <w:sdtContent>
@@ -1554,7 +1812,7 @@
               <w:rFonts w:ascii="Cardo" w:cs="Cardo" w:eastAsia="Cardo" w:hAnsi="Cardo"/>
               <w:rtl w:val="0"/>
             </w:rPr>
-            <w:t xml:space="preserve">☑</w:t>
+            <w:t xml:space="preserve">☐</w:t>
           </w:r>
         </w:sdtContent>
       </w:sdt>
@@ -1583,7 +1841,7 @@
       </w:pPr>
       <w:sdt>
         <w:sdtPr>
-          <w:id w:val="-2020604763"/>
+          <w:id w:val="1338767610"/>
           <w:tag w:val="goog_rdk_11"/>
         </w:sdtPr>
         <w:sdtContent>
@@ -1592,7 +1850,7 @@
               <w:rFonts w:ascii="Cardo" w:cs="Cardo" w:eastAsia="Cardo" w:hAnsi="Cardo"/>
               <w:rtl w:val="0"/>
             </w:rPr>
-            <w:t xml:space="preserve">☑</w:t>
+            <w:t xml:space="preserve">☐</w:t>
           </w:r>
         </w:sdtContent>
       </w:sdt>
@@ -1619,7 +1877,7 @@
       </w:pPr>
       <w:sdt>
         <w:sdtPr>
-          <w:id w:val="54679108"/>
+          <w:id w:val="1126352002"/>
           <w:tag w:val="goog_rdk_12"/>
         </w:sdtPr>
         <w:sdtContent>
@@ -1876,7 +2134,7 @@
       </w:r>
       <w:sdt>
         <w:sdtPr>
-          <w:id w:val="1397492426"/>
+          <w:id w:val="956301249"/>
           <w:tag w:val="goog_rdk_13"/>
         </w:sdtPr>
         <w:sdtContent>
@@ -2028,7 +2286,7 @@
       </w:pPr>
       <w:sdt>
         <w:sdtPr>
-          <w:id w:val="816115943"/>
+          <w:id w:val="1612105995"/>
           <w:tag w:val="goog_rdk_14"/>
         </w:sdtPr>
         <w:sdtContent>
@@ -2094,7 +2352,7 @@
           <w:szCs w:val="19"/>
           <w:rtl w:val="0"/>
         </w:rPr>
-        <w:t xml:space="preserve">Signature: Roma</w:t>
+        <w:t xml:space="preserve">Signature:</w:t>
       </w:r>
       <w:r>
         <w:rPr>
@@ -2131,7 +2389,7 @@
           <w:szCs w:val="19"/>
           <w:rtl w:val="0"/>
         </w:rPr>
-        <w:t xml:space="preserve">Full Name (Print): ROMA JAWAHIRANI</w:t>
+        <w:t xml:space="preserve">Full Name (Print):</w:t>
       </w:r>
       <w:r>
         <w:rPr>
@@ -2168,7 +2426,7 @@
           <w:szCs w:val="19"/>
           <w:rtl w:val="0"/>
         </w:rPr>
-        <w:t xml:space="preserve">Relationship to Minor: MOTHER</w:t>
+        <w:t xml:space="preserve">Relationship to Minor:</w:t>
       </w:r>
       <w:r>
         <w:rPr>
@@ -2205,7 +2463,7 @@
           <w:szCs w:val="19"/>
           <w:rtl w:val="0"/>
         </w:rPr>
-        <w:t xml:space="preserve">Date:31/08/26</w:t>
+        <w:t xml:space="preserve">Date:</w:t>
       </w:r>
       <w:r>
         <w:rPr>
@@ -2242,7 +2500,7 @@
           <w:szCs w:val="19"/>
           <w:rtl w:val="0"/>
         </w:rPr>
-        <w:t xml:space="preserve">Place:NAGPUR</w:t>
+        <w:t xml:space="preserve">Place:</w:t>
       </w:r>
       <w:r>
         <w:rPr>
@@ -2271,7 +2529,7 @@
       </w:pPr>
       <w:sdt>
         <w:sdtPr>
-          <w:id w:val="1353183451"/>
+          <w:id w:val="-1688347059"/>
           <w:tag w:val="goog_rdk_15"/>
         </w:sdtPr>
         <w:sdtContent>
@@ -2484,7 +2742,7 @@
       </w:pPr>
       <w:sdt>
         <w:sdtPr>
-          <w:id w:val="246946248"/>
+          <w:id w:val="-802666679"/>
           <w:tag w:val="goog_rdk_16"/>
         </w:sdtPr>
         <w:sdtContent>
@@ -2686,7 +2944,7 @@
       </w:pPr>
       <w:sdt>
         <w:sdtPr>
-          <w:id w:val="274618998"/>
+          <w:id w:val="-207583502"/>
           <w:tag w:val="goog_rdk_17"/>
         </w:sdtPr>
         <w:sdtContent>
@@ -2716,7 +2974,7 @@
       </w:pPr>
       <w:sdt>
         <w:sdtPr>
-          <w:id w:val="-97777907"/>
+          <w:id w:val="516316178"/>
           <w:tag w:val="goog_rdk_18"/>
         </w:sdtPr>
         <w:sdtContent>
@@ -2777,7 +3035,7 @@
       </w:pPr>
       <w:sdt>
         <w:sdtPr>
-          <w:id w:val="1787233103"/>
+          <w:id w:val="2021097560"/>
           <w:tag w:val="goog_rdk_19"/>
         </w:sdtPr>
         <w:sdtContent>

</xml_diff>